<commit_message>
Fix Chapter 5 accuracy after cross-check with chapters 1-4.
Align team roles with the resource plan, correct RACI wording, clarify charter budget vs detailed estimate, fix the page-load risk phrasing, and replace placeholder risk-monitoring examples with concrete entries.

Co-authored-by: Oliver Le <revilo-lgtm@users.noreply.github.com>
</commit_message>
<xml_diff>
--- a/chuong-5.docx
+++ b/chuong-5.docx
@@ -30,7 +30,7 @@
           <w:i w:val="0"/>
           <w:sz w:val="26"/>
         </w:rPr>
-        <w:t>Quản lý truyền thông và quản lý rủi ro là hai nhóm công việc xuyên suốt vòng đời dự án xây dựng website thương mại điện tử HOALYLY.vn. Trên nền tảng các bên liên quan đã xác định tại Chương 2 (ma trận RACI), lịch trình và WBS tại Chương 3, cùng ngân sách và nguồn lực tại Chương 4, chương này cụ thể hóa kênh trao đổi thông tin, mẫu báo cáo vận hành, đồng thời xây dựng danh mục rủi ro, đánh giá định tính và phương án ứng phó phù hợp với quy mô hộ kinh doanh nhỏ và mô hình Agile/Scrum đã lựa chọn.</w:t>
+        <w:t>Quản lý truyền thông và quản lý rủi ro là hai nhóm công việc xuyên suốt vòng đời dự án xây dựng website thương mại điện tử HOALYLY.vn. Trên nền tảng các bên liên quan và ma trận RACI tại Chương 2, WBS cùng lịch trình tại Chương 3, ngân sách và nguồn lực tại Chương 4, chương này cụ thể hóa kênh trao đổi thông tin, mẫu báo cáo vận hành, đồng thời xây dựng danh mục rủi ro, đánh giá định tính và phương án ứng phó phù hợp với quy mô hộ kinh doanh nhỏ và mô hình Agile/Scrum đã lựa chọn.</w:t>
       </w:r>
     </w:p>
     <w:p>
@@ -61,7 +61,7 @@
           <w:i w:val="0"/>
           <w:sz w:val="26"/>
         </w:rPr>
-        <w:t>Quản lý truyền thông nhằm bảo đảm đúng thông tin đến đúng người, đúng thời điểm và bằng phương thức phù hợp. Với đội ngũ lõi gồm Quản lý dự án (PM/Scrum Master), hai lập trình viên, Tester/QA và Chủ cửa hàng HOALYLY với vai trò Product Owner, việc thiết lập kế hoạch truyền thông rõ ràng giúp giảm lệch pha giữa yêu cầu nghiệp vụ và giải pháp kỹ thuật, đồng thời hỗ trợ kiểm soát tiến độ, chi phí và chất lượng theo từng Sprint.</w:t>
+        <w:t>Quản lý truyền thông nhằm bảo đảm đúng thông tin đến đúng người, đúng thời điểm và bằng phương thức phù hợp. Theo phân công tại mục 2.4 và kế hoạch nguồn lực mục 4.2, đội dự án gồm Quản lý dự án (PM/Scrum Master), hai lập trình viên, UI/UX Designer, Tester/QA và Chủ cửa hàng HOALYLY với vai trò Product Owner. Việc thiết lập kế hoạch truyền thông rõ ràng giúp giảm lệch pha giữa yêu cầu nghiệp vụ và giải pháp kỹ thuật, đồng thời hỗ trợ kiểm soát tiến độ, chi phí và chất lượng theo từng Sprint.</w:t>
       </w:r>
     </w:p>
     <w:p>
@@ -450,7 +450,7 @@
                 <w:i w:val="0"/>
                 <w:sz w:val="26"/>
               </w:rPr>
-              <w:t>Trạng thái công việc, blocker kỹ thuật, kết quả kiểm thử, chi phí phát sinh</w:t>
+              <w:t>Trạng thái công việc, rào cản kỹ thuật, kết quả kiểm thử, chi phí phát sinh</w:t>
             </w:r>
           </w:p>
         </w:tc>
@@ -473,7 +473,7 @@
                 <w:i w:val="0"/>
                 <w:sz w:val="26"/>
               </w:rPr>
-              <w:t>Dev, Tester</w:t>
+              <w:t>Dev, Tester, Designer</w:t>
             </w:r>
           </w:p>
         </w:tc>
@@ -496,7 +496,7 @@
                 <w:i w:val="0"/>
                 <w:sz w:val="26"/>
               </w:rPr>
-              <w:t>Hàng ngày (standup ngắn) và hàng tuần</w:t>
+              <w:t>Hàng ngày (họp standup ngắn) và hàng tuần</w:t>
             </w:r>
           </w:p>
         </w:tc>
@@ -567,7 +567,7 @@
                 <w:i w:val="0"/>
                 <w:sz w:val="26"/>
               </w:rPr>
-              <w:t>Đội phát triển (Dev)</w:t>
+              <w:t>Đội phát triển (Dev, Designer)</w:t>
             </w:r>
           </w:p>
         </w:tc>
@@ -962,7 +962,7 @@
                 <w:i w:val="0"/>
                 <w:sz w:val="26"/>
               </w:rPr>
-              <w:t>Vận hành hệ thống sau go-live</w:t>
+              <w:t>Vận hành hệ thống sau triển khai chính thức</w:t>
             </w:r>
           </w:p>
         </w:tc>
@@ -1219,7 +1219,7 @@
                 <w:i w:val="0"/>
                 <w:sz w:val="26"/>
               </w:rPr>
-              <w:t>Email hệ thống (đã thiết kế trong luồng đặt hàng)</w:t>
+              <w:t>Email hệ thống (theo luồng đặt hàng đã thiết kế tại Chương 3)</w:t>
             </w:r>
           </w:p>
         </w:tc>
@@ -1290,7 +1290,7 @@
           <w:i w:val="0"/>
           <w:sz w:val="26"/>
         </w:rPr>
-        <w:t>Kế hoạch trên bám sát phân công RACI: Chủ shop là Accountable đối với nghiệm thu và phê duyệt; PM chịu trách nhiệm tổ chức họp, tổng hợp báo cáo; Đội phát triển và Tester là người thực hiện kỹ thuật và được Inform/Consult đúng lúc. Các buổi họp hàng tuần giữa đội phát triển và Chủ cửa hàng (đã nêu như bài học vận hành tại phần kết luận tổng thể) được duy trì như kênh chính để phát hiện sớm lệch yêu cầu.</w:t>
+        <w:t>Kế hoạch trên bám sát ma trận RACI tại mục 2.2: Chủ shop là Accountable đối với nghiệm thu, đào tạo người dùng và phê duyệt các hạng mục then chốt; PM là Responsible trong điều phối, báo cáo tiến độ và tổ chức họp; Đội phát triển là Responsible trong lập trình, thiết kế và tham gia kiểm thử. Các cuộc họp hàng tuần giữa nhóm phát triển và Chủ cửa hàng (đã nêu tại mục 2.3 khi lựa chọn Agile/Scrum) được duy trì như kênh chính để phát hiện sớm lệch yêu cầu.</w:t>
       </w:r>
     </w:p>
     <w:p>
@@ -1321,7 +1321,7 @@
           <w:i w:val="0"/>
           <w:sz w:val="26"/>
         </w:rPr>
-        <w:t>Dự án sử dụng bộ công cụ gọn, chi phí thấp, phù hợp nhóm nhỏ và môi trường làm việc phân tán:</w:t>
+        <w:t>Dự án sử dụng bộ công cụ gọn, chi phí thấp, phù hợp nhóm nhỏ và môi trường làm việc phân tán. Các công cụ dưới đây trùng với danh mục đề xuất trong đề cương chương và phù hợp khoản chi công cụ phát triển đã dự toán tại mục 4.1.1 (Visual Studio Community, Figma, Git):</w:t>
       </w:r>
     </w:p>
     <w:tbl>
@@ -1552,7 +1552,7 @@
                 <w:i w:val="0"/>
                 <w:sz w:val="26"/>
               </w:rPr>
-              <w:t>Nhắc việc hằng ngày, thông báo blocker khẩn, chia sẻ link họp và cập nhật ngắn về tiến độ</w:t>
+              <w:t>Nhắc việc hằng ngày, thông báo rào cản khẩn, chia sẻ link họp và cập nhật ngắn về tiến độ</w:t>
             </w:r>
           </w:p>
         </w:tc>
@@ -1623,7 +1623,7 @@
                 <w:i w:val="0"/>
                 <w:sz w:val="26"/>
               </w:rPr>
-              <w:t>Daily standup ngắn, Sprint Review/Demo, Sprint Retrospective, họp xử lý rủi ro hoặc thay đổi phạm vi</w:t>
+              <w:t>Họp standup ngắn, Sprint Review/Demo, Sprint Retrospective, họp xử lý rủi ro hoặc thay đổi phạm vi</w:t>
             </w:r>
           </w:p>
         </w:tc>
@@ -1765,7 +1765,7 @@
                 <w:i w:val="0"/>
                 <w:sz w:val="26"/>
               </w:rPr>
-              <w:t>Repository ASP.NET MVC, Pull Request, code review, Issues theo dõi lỗi; hỗ trợ quy trình merge vào nhánh develop sau khi khắc phục vấn đề mức Cao (đã áp dụng trong đánh giá chất lượng mã nguồn)</w:t>
+              <w:t>Repository ASP.NET MVC, Pull Request, code review, Issues theo dõi lỗi; hỗ trợ quy trình merge vào nhánh develop sau khi khắc phục vấn đề mức Cao (theo biên bản đánh giá chất lượng mã nguồn tại phần quản lý chất lượng)</w:t>
             </w:r>
           </w:p>
         </w:tc>
@@ -1813,7 +1813,7 @@
           <w:i w:val="0"/>
           <w:sz w:val="26"/>
         </w:rPr>
-        <w:t>Nguyên tắc sử dụng: thông tin quyết định và phê duyệt phải có bản ghi trên Email hoặc biên bản họp; trao đổi kỹ thuật và trạng thái task ưu tiên Trello/GitHub; Zalo chỉ dùng cho thông tin ngắn, không thay thế tài liệu chính thức. Cách phân tầng này giúp giảm nhiễu thông tin nhưng vẫn giữ tốc độ phản hồi cần thiết với mô hình Agile.</w:t>
+        <w:t>Nguyên tắc sử dụng: thông tin quyết định và phê duyệt phải có bản ghi trên Email hoặc biên bản họp; trao đổi kỹ thuật và trạng thái công việc ưu tiên Trello/GitHub; Zalo chỉ dùng cho thông tin ngắn, không thay thế tài liệu chính thức. Cách phân tầng này giúp giảm nhiễu thông tin nhưng vẫn giữ tốc độ phản hồi cần thiết với mô hình Agile.</w:t>
       </w:r>
     </w:p>
     <w:p>
@@ -1844,7 +1844,7 @@
           <w:i w:val="0"/>
           <w:sz w:val="26"/>
         </w:rPr>
-        <w:t>Hai nhóm tài liệu vận hành chính là báo cáo tiến độ tuần và biên bản họp. Chúng phục vụ giám sát theo nhóm tiến trình Monitoring &amp; Controlling của PMBOK đã nêu tại Chương 1, đồng thời cung cấp dữ liệu đầu vào cho kiểm soát chi phí (so sánh thực tế với kế hoạch cuối mỗi tuần tại mục 4.1.3) và cập nhật rủi ro.</w:t>
+        <w:t>Hai nhóm tài liệu vận hành chính là báo cáo tiến độ tuần và biên bản họp. Chúng phục vụ giám sát theo nhóm tiến trình Giám sát và kiểm soát (Monitoring &amp; Controlling) của PMBOK đã nêu tại Chương 1, đồng thời cung cấp dữ liệu đầu vào cho kiểm soát chi phí (so sánh thực tế với kế hoạch cuối mỗi tuần tại mục 4.1.3) và cập nhật rủi ro.</w:t>
       </w:r>
     </w:p>
     <w:p>
@@ -1920,7 +1920,7 @@
           <w:i w:val="0"/>
           <w:sz w:val="26"/>
         </w:rPr>
-        <w:t>3. Chi phí phát sinh trong tuần và tỷ lệ tiêu thụ ngân sách so với tổng dự toán khoảng 33.990.000 VND.</w:t>
+        <w:t>3. Chi phí phát sinh trong tuần và tỷ lệ tiêu thụ ngân sách so với tổng dự toán 33.990.000 VND tại mục 4.1.1 (vẫn nằm trong trần ngân sách không vượt quá 50.000.000 VND theo Project Charter).</w:t>
       </w:r>
     </w:p>
     <w:p>
@@ -2076,7 +2076,7 @@
                 <w:i w:val="0"/>
                 <w:sz w:val="26"/>
               </w:rPr>
-              <w:t>Ví dụ: Tuần 5 / Sprint 2</w:t>
+              <w:t>Ví dụ: Tuần 5 / Sprint 2 (theo lịch Sprint tại mục 2.4)</w:t>
             </w:r>
           </w:p>
         </w:tc>
@@ -2149,7 +2149,7 @@
                 <w:i w:val="0"/>
                 <w:sz w:val="26"/>
               </w:rPr>
-              <w:t>Công việc chậm / blocker</w:t>
+              <w:t>Công việc chậm / rào cản</w:t>
             </w:r>
           </w:p>
         </w:tc>
@@ -2220,7 +2220,7 @@
                 <w:i w:val="0"/>
                 <w:sz w:val="26"/>
               </w:rPr>
-              <w:t>Chi thực tế / kế hoạch; mức chênh lệch (%)</w:t>
+              <w:t>Chi thực tế / kế hoạch; mức chênh lệch (%) theo bảng 4.4</w:t>
             </w:r>
           </w:p>
         </w:tc>
@@ -2379,7 +2379,7 @@
           <w:i w:val="0"/>
           <w:sz w:val="26"/>
         </w:rPr>
-        <w:t>Các cuộc họp có quyết định (Sprint Planning, Sprint Review, họp thay đổi phạm vi, họp xử lý rủi ro Cao) đều lập biên bản. Biên bản ghi: thời gian, thành phần tham dự, nội dung thảo luận, quyết định, hành động tiếp theo (action items), người phụ trách và hạn hoàn thành. Biên bản được lưu trên Email nhóm và đính kèm liên kết Trello/GitHub liên quan. Đối với UAT và nghiệm thu, biên bản nghiệm thu (deliverable của gói WBS 6.4) là căn cứ bàn giao chính thức.</w:t>
+        <w:t>Các cuộc họp có quyết định (Sprint Planning, Sprint Review, họp thay đổi phạm vi, họp xử lý rủi ro mức Cao) đều lập biên bản. Biên bản ghi: thời gian, thành phần tham dự, nội dung thảo luận, quyết định, hành động tiếp theo, người phụ trách và hạn hoàn thành. Biên bản được lưu trên Email nhóm và đính kèm liên kết Trello/GitHub liên quan. Đối với UAT và nghiệm thu, biên bản nghiệm thu (sản phẩm bàn giao của gói WBS 6.4) là căn cứ bàn giao chính thức.</w:t>
       </w:r>
     </w:p>
     <w:p>
@@ -2395,7 +2395,7 @@
           <w:i w:val="0"/>
           <w:sz w:val="26"/>
         </w:rPr>
-        <w:t>Việc duy trì báo cáo tuần và biên bản họp tạo vòng phản hồi khép kín: thông tin từ thực thi được chuyển thành quyết định của PO/Sponsor, rồi cập nhật lại backlog và kế hoạch nguồn lực, giảm nguy cơ “vỡ phạm vi” đã được cảnh báo trong các chương trước.</w:t>
+        <w:t>Việc duy trì báo cáo tuần và biên bản họp tạo vòng phản hồi khép kín: thông tin từ thực thi được chuyển thành quyết định của PO/Sponsor, rồi cập nhật lại backlog và kế hoạch nguồn lực, giảm nguy cơ mở rộng phạm vi không kiểm soát (scope creep) đã được cảnh báo khi xác định phạm vi tại Chương 3.</w:t>
       </w:r>
     </w:p>
     <w:p>
@@ -2426,7 +2426,7 @@
           <w:i w:val="0"/>
           <w:sz w:val="26"/>
         </w:rPr>
-        <w:t>Quản lý rủi ro trong dự án HOALYLY.vn được gắn với gói công việc WBS 1.2 (Quản lý rủi ro) và hoạt động giám sát liên tục tại WBS 1.3. Mục tiêu là nhận diện sớm các yếu tố có thể làm trễ tiến độ 4 tháng (16 tuần), vượt ngân sách dưới 50 triệu VND, suy giảm chất lượng (tốc độ tải, bảo mật, tương thích) hoặc ảnh hưởng vận hành cửa hàng sau triển khai.</w:t>
+        <w:t>Quản lý rủi ro trong dự án HOALYLY.vn được gắn với gói công việc WBS 1.2 (Quản lý rủi ro) và hoạt động giám sát liên tục tại WBS 1.3. Mục tiêu là nhận diện sớm các yếu tố có thể làm trễ tiến độ cam kết 4 tháng (16 tuần, hạn hoàn thành 30/11/2026 theo mục 2.1), vượt trần ngân sách 50.000.000 VND hoặc vượt xa dự toán 33.990.000 VND, suy giảm chất lượng (tốc độ tải, bảo mật, tương thích) hoặc ảnh hưởng vận hành cửa hàng sau triển khai.</w:t>
       </w:r>
     </w:p>
     <w:p>
@@ -2457,7 +2457,7 @@
           <w:i w:val="0"/>
           <w:sz w:val="26"/>
         </w:rPr>
-        <w:t>Danh mục rủi ro được xây dựng từ các ràng buộc và giả định tại Project Charter (mục 2.1), đặc thù ngành hoa tươi (vòng đời ngắn, cao điểm lễ), phạm vi loại trừ (không làm app mobile, không thanh toán thẻ quốc tế), lựa chọn công nghệ .NET/SQL Server, cũng như các điểm đã ghi nhận trong kiểm thử và review mã nguồn (validation form, tối ưu truy vấn, xử lý exception còn thiếu ở một số API).</w:t>
+        <w:t>Danh mục rủi ro được xây dựng từ các ràng buộc và giả định tại Project Charter (mục 2.1), đặc thù ngành hoa tươi (vòng đời ngắn, cao điểm lễ), phạm vi loại trừ (không phát triển ứng dụng di động, không tích hợp thanh toán thẻ quốc tế), lựa chọn công nghệ .NET/SQL Server, cũng như các điểm đã ghi nhận trong kiểm thử và review mã nguồn (validation form, tối ưu truy vấn, xử lý exception còn thiếu ở một số API).</w:t>
       </w:r>
     </w:p>
     <w:tbl>
@@ -2738,7 +2738,7 @@
                 <w:i w:val="0"/>
                 <w:sz w:val="26"/>
               </w:rPr>
-              <w:t>Chi phí phát sinh ngoài dự toán 33.990.000 VND (nhân công, hosting, phát sinh tính năng)</w:t>
+              <w:t>Chi phí phát sinh ngoài dự toán 33.990.000 VND (nhân công, hosting, phát sinh tính năng), có nguy cơ tiến sát hoặc vượt trần 50.000.000 VND</w:t>
             </w:r>
           </w:p>
         </w:tc>
@@ -2761,7 +2761,7 @@
                 <w:i w:val="0"/>
                 <w:sz w:val="26"/>
               </w:rPr>
-              <w:t>Toàn dự án, đặc biệt khi scope thay đổi</w:t>
+              <w:t>Toàn dự án, đặc biệt khi phạm vi thay đổi</w:t>
             </w:r>
           </w:p>
         </w:tc>
@@ -2855,7 +2855,7 @@
                 <w:i w:val="0"/>
                 <w:sz w:val="26"/>
               </w:rPr>
-              <w:t>Sprint lõi và nâng cao; giai đoạn kiểm thử</w:t>
+              <w:t>Sprint 2-3 (lõi và nâng cao) và giai đoạn kiểm thử</w:t>
             </w:r>
           </w:p>
         </w:tc>
@@ -2926,7 +2926,7 @@
                 <w:i w:val="0"/>
                 <w:sz w:val="26"/>
               </w:rPr>
-              <w:t>Chủ shop bổ sung tính năng ngoài phạm vi đã chốt (ví dụ yêu cầu gần với app mobile hoặc cổng thanh toán phức tạp)</w:t>
+              <w:t>Chủ shop bổ sung tính năng ngoài phạm vi đã chốt (ví dụ yêu cầu gần với ứng dụng di động hoặc cổng thanh toán thẻ quốc tế đã loại trừ)</w:t>
             </w:r>
           </w:p>
         </w:tc>
@@ -3020,7 +3020,7 @@
                 <w:i w:val="0"/>
                 <w:sz w:val="26"/>
               </w:rPr>
-              <w:t>Mất hoặc hỏng dữ liệu sản phẩm, đơn hàng, khách hàng trên SQL Server (môi trường dev/staging/production)</w:t>
+              <w:t>Mất hoặc hỏng dữ liệu sản phẩm, đơn hàng, khách hàng trên SQL Server (môi trường phát triển, staging hoặc production)</w:t>
             </w:r>
           </w:p>
         </w:tc>
@@ -3114,7 +3114,7 @@
                 <w:i w:val="0"/>
                 <w:sz w:val="26"/>
               </w:rPr>
-              <w:t>Thành viên đội (Dev, Tester) hoặc PO không dành đủ thời gian theo kế hoạch huy động</w:t>
+              <w:t>Thành viên đội (Dev, Designer, Tester) hoặc PO không dành đủ thời gian theo kế hoạch huy động mục 4.2.2</w:t>
             </w:r>
           </w:p>
         </w:tc>
@@ -3208,7 +3208,7 @@
                 <w:i w:val="0"/>
                 <w:sz w:val="26"/>
               </w:rPr>
-              <w:t>Lỗ hổng XSS/SQL Injection, lộ thông tin khách hàng hoặc sự cố tài khoản Admin</w:t>
+              <w:t>Lỗ hổng XSS/SQL Injection/CSRF, lộ thông tin khách hàng hoặc sự cố tài khoản Admin</w:t>
             </w:r>
           </w:p>
         </w:tc>
@@ -3231,7 +3231,7 @@
                 <w:i w:val="0"/>
                 <w:sz w:val="26"/>
               </w:rPr>
-              <w:t>Phát triển xác thực/phân quyền; trước go-live</w:t>
+              <w:t>Phát triển xác thực/phân quyền; trước triển khai chính thức</w:t>
             </w:r>
           </w:p>
         </w:tc>
@@ -3302,7 +3302,7 @@
                 <w:i w:val="0"/>
                 <w:sz w:val="26"/>
               </w:rPr>
-              <w:t>Nhà cung cấp gián đoạn dịch vụ, cấu hình Windows Hosting/SQL Server không đúng cam kết</w:t>
+              <w:t>Nhà cung cấp gián đoạn dịch vụ, cấu hình Windows Hosting/SQL Server không đúng cam kết (liên quan giả định ổn định hạ tầng tại mục 2.1)</w:t>
             </w:r>
           </w:p>
         </w:tc>
@@ -3396,7 +3396,7 @@
                 <w:i w:val="0"/>
                 <w:sz w:val="26"/>
               </w:rPr>
-              <w:t>Tốc độ tải vượt ngưỡng dưới 3 giây hoặc trải nghiệm đặt hàng kém trên mobile, ảnh hưởng chuyển đổi đơn</w:t>
+              <w:t>Tốc độ tải vượt quá ngưỡng 3 giây hoặc trải nghiệm đặt hàng kém trên mobile, ảnh hưởng khả năng xử lý đơn và chuyển đổi</w:t>
             </w:r>
           </w:p>
         </w:tc>
@@ -3482,7 +3482,7 @@
           <w:i w:val="0"/>
           <w:sz w:val="26"/>
         </w:rPr>
-        <w:t>Phân tích định tính dùng ma trận Xác suất - Tác động với thang điểm 1 đến 5. Mức rủi ro = Xác suất × Tác động. Quy ước mức độ: Thấp (1-6), Trung bình (7-12), Cao (13-25).</w:t>
+        <w:t>Phân tích định tính dùng ma trận Xác suất - Tác động với thang điểm 1 đến 5. Mức rủi ro = Xác suất x Tác động. Quy ước mức độ: Thấp (1-6), Trung bình (7-12), Cao (13-25).</w:t>
       </w:r>
     </w:p>
     <w:p>
@@ -3729,7 +3729,7 @@
                 <w:i w:val="0"/>
                 <w:sz w:val="26"/>
               </w:rPr>
-              <w:t>Chậm vài ngày hoặc chi phí nhỏ trong dự phòng</w:t>
+              <w:t>Chậm vài ngày hoặc chi phí nhỏ trong quỹ dự phòng</w:t>
             </w:r>
           </w:p>
         </w:tc>
@@ -3800,7 +3800,7 @@
                 <w:i w:val="0"/>
                 <w:sz w:val="26"/>
               </w:rPr>
-              <w:t>Ảnh hưởng một milestone hoặc module quan trọng</w:t>
+              <w:t>Ảnh hưởng một mốc (milestone) hoặc module quan trọng</w:t>
             </w:r>
           </w:p>
         </w:tc>
@@ -5468,7 +5468,7 @@
           <w:i w:val="0"/>
           <w:sz w:val="26"/>
         </w:rPr>
-        <w:t>Nhóm rủi ro Cao cần ưu tiên điều hành trong họp tuần gồm R01 (tiến độ), R03 (lỗi kỹ thuật/tích hợp) và R07 (bảo mật). Các rủi ro Trung bình được theo dõi kèm chỉ số chi phí và phản hồi Sprint Review.</w:t>
+        <w:t>Nhóm rủi ro Cao cần ưu tiên điều hành trong họp tuần gồm R01 (tiến độ), R03 (lỗi kỹ thuật/tích hợp) và R07 (bảo mật). Các rủi ro Trung bình được theo dõi kèm chỉ số chi phí (bảng 4.4) và phản hồi Sprint Review.</w:t>
       </w:r>
     </w:p>
     <w:p>
@@ -6398,7 +6398,7 @@
           <w:i w:val="0"/>
           <w:sz w:val="26"/>
         </w:rPr>
-        <w:t>Chiến lược ứng phó được chọn theo mức độ và khả năng kiểm soát của nhóm: Giảm thiểu (Mitigate) là ưu tiên với hầu hết rủi ro kỹ thuật và tiến độ; Chuyển giao (Transfer) áp dụng một phần với hạ tầng thuê ngoài; Chấp nhận (Accept) chỉ với phần dư còn lại sau khi đã có dự phòng 10% và kiểm soát chênh lệch chi phí theo bảng 4.4.</w:t>
+        <w:t>Chiến lược ứng phó được chọn theo mức độ và khả năng kiểm soát của nhóm: Giảm thiểu (Mitigate) là ưu tiên với hầu hết rủi ro kỹ thuật và tiến độ; Chuyển giao (Transfer) áp dụng một phần với hạ tầng thuê ngoài; Chấp nhận (Accept) chỉ với phần dư còn lại sau khi đã có dự phòng 10% (3.090.000 VND) và kiểm soát chênh lệch chi phí theo bảng 4.4.</w:t>
       </w:r>
     </w:p>
     <w:tbl>
@@ -6612,7 +6612,7 @@
                 <w:i w:val="0"/>
                 <w:sz w:val="26"/>
               </w:rPr>
-              <w:t>Ưu tiên công việc trên đường găng; chia nhỏ deliverable theo Sprint 1-5; standup hàng ngày để gỡ blocker; tái phân bổ Dev khi một nhánh FE/BE chậm</w:t>
+              <w:t>Ưu tiên công việc trên đường găng; chia nhỏ sản phẩm bàn giao theo Sprint 1-5 tại mục 2.4; họp standup hàng ngày để gỡ rào cản; tái phân bổ Dev khi một nhánh Frontend/Backend chậm</w:t>
             </w:r>
           </w:p>
         </w:tc>
@@ -6658,7 +6658,7 @@
                 <w:i w:val="0"/>
                 <w:sz w:val="26"/>
               </w:rPr>
-              <w:t>Task Done thấp hơn kế hoạch Sprint hai ngày liên tiếp</w:t>
+              <w:t>Số việc hoàn thành thấp hơn kế hoạch Sprint trong hai ngày liên tiếp</w:t>
             </w:r>
           </w:p>
         </w:tc>
@@ -6729,7 +6729,7 @@
                 <w:i w:val="0"/>
                 <w:sz w:val="26"/>
               </w:rPr>
-              <w:t>Bám dự toán và quỹ dự phòng 3.090.000 VND; phê duyệt chi theo ngưỡng 1.000.000 VND; nếu chênh lệch &gt;10% thì thu hẹp phạm vi hoặc xin Chủ shop gia hạn ngân sách</w:t>
+              <w:t>Bám dự toán và quỹ dự phòng 3.090.000 VND; phê duyệt chi theo ngưỡng 1.000.000 VND; nếu chênh lệch &gt;10% thì thu hẹp phạm vi hoặc xin Chủ shop điều chỉnh ngân sách theo bảng 4.4</w:t>
             </w:r>
           </w:p>
         </w:tc>
@@ -6775,7 +6775,7 @@
                 <w:i w:val="0"/>
                 <w:sz w:val="26"/>
               </w:rPr>
-              <w:t>Chi tiêu tuần vượt kế hoạch giai đoạn tương ứng</w:t>
+              <w:t>Chi tiêu tuần vượt kế hoạch giai đoạn tương ứng tại mục 4.1.2</w:t>
             </w:r>
           </w:p>
         </w:tc>
@@ -6846,7 +6846,7 @@
                 <w:i w:val="0"/>
                 <w:sz w:val="26"/>
               </w:rPr>
-              <w:t>Tích hợp thanh toán và module lõi sớm (Sprint 2-3); unit/integration test; dùng Postman kiểm API; sửa lỗi Cao trước khi merge develop</w:t>
+              <w:t>Tích hợp thanh toán và module lõi sớm (Sprint 2-3); unit/integration test; dùng Postman kiểm API; sửa lỗi mức Cao trước khi merge vào nhánh develop</w:t>
             </w:r>
           </w:p>
         </w:tc>
@@ -6963,7 +6963,7 @@
                 <w:i w:val="0"/>
                 <w:sz w:val="26"/>
               </w:rPr>
-              <w:t>Chốt phạm vi In/Out tại Charter và WBS; mọi yêu cầu mới qua Product Backlog và PO ưu tiên; đánh giá tác động tới lịch/chi phí trước khi nhận vào Sprint</w:t>
+              <w:t>Chốt phạm vi bao gồm/không bao gồm tại Charter và WBS; mọi yêu cầu mới đưa vào Product Backlog để PO ưu tiên; đánh giá tác động tới lịch và chi phí trước khi nhận vào Sprint</w:t>
             </w:r>
           </w:p>
         </w:tc>
@@ -7009,7 +7009,7 @@
                 <w:i w:val="0"/>
                 <w:sz w:val="26"/>
               </w:rPr>
-              <w:t>Số yêu cầu mới phát sinh ngoài backlog đã chốt tăng đột biến</w:t>
+              <w:t>Số yêu cầu mới ngoài backlog đã chốt tăng đột biến sau Sprint Review</w:t>
             </w:r>
           </w:p>
         </w:tc>
@@ -7080,7 +7080,7 @@
                 <w:i w:val="0"/>
                 <w:sz w:val="26"/>
               </w:rPr>
-              <w:t>Sao lưu SQL Server định kỳ; kiểm tra restore trước go-live; hạn chế thao tác trực tiếp trên production; phân quyền Admin chặt</w:t>
+              <w:t>Sao lưu SQL Server định kỳ; kiểm tra phục hồi dữ liệu trước triển khai chính thức; hạn chế thao tác trực tiếp trên production; phân quyền Admin chặt</w:t>
             </w:r>
           </w:p>
         </w:tc>
@@ -7126,7 +7126,7 @@
                 <w:i w:val="0"/>
                 <w:sz w:val="26"/>
               </w:rPr>
-              <w:t>Lỗi ghi/đọc dữ liệu hoặc mất bản sao lưu gần nhất</w:t>
+              <w:t>Lỗi ghi/đọc dữ liệu hoặc thiếu bản sao lưu gần nhất</w:t>
             </w:r>
           </w:p>
         </w:tc>
@@ -7197,7 +7197,7 @@
                 <w:i w:val="0"/>
                 <w:sz w:val="26"/>
               </w:rPr>
-              <w:t>Phân công rõ theo bảng nhân sự; tài liệu hóa thiết kế CSDL và module quan trọng; cross-review để giảm phụ thuộc một người; PM điều chỉnh lịch huy động theo mục 4.2.2</w:t>
+              <w:t>Phân công rõ theo bảng nhân sự mục 2.4; tài liệu hóa thiết kế cơ sở dữ liệu và module quan trọng; review chéo để giảm phụ thuộc một người; PM điều chỉnh lịch huy động theo mục 4.2.2</w:t>
             </w:r>
           </w:p>
         </w:tc>
@@ -7314,7 +7314,7 @@
                 <w:i w:val="0"/>
                 <w:sz w:val="26"/>
               </w:rPr>
-              <w:t>Áp dụng HTTPS/SSL; chống XSS/CSRF và SQL Injection nhờ thực hành ASP.NET MVC và Entity Framework; review bảo mật trước triển khai; hoàn thiện xử lý exception và kiểm thử bảo mật cơ bản trước live</w:t>
+              <w:t>Áp dụng HTTPS/SSL; phòng chống XSS, CSRF và SQL Injection theo thực hành ASP.NET MVC và Entity Framework; review bảo mật trước triển khai; hoàn thiện xử lý exception và kiểm thử bảo mật cơ bản trước khi đưa lên môi trường thật</w:t>
             </w:r>
           </w:p>
         </w:tc>
@@ -7431,7 +7431,7 @@
                 <w:i w:val="0"/>
                 <w:sz w:val="26"/>
               </w:rPr>
-              <w:t>Chọn nhà cung cấp Windows Hosting hỗ trợ ASP.NET MVC và SQL Server theo dự toán; giữ liên hệ hỗ trợ bằng Email; có checklist cấu hình môi trường (WBS 7.1)</w:t>
+              <w:t>Chọn nhà cung cấp Windows Hosting hỗ trợ ASP.NET MVC và SQL Server theo dự toán mục 4.1.1; giữ liên hệ hỗ trợ bằng Email; có checklist cấu hình môi trường (WBS 7.1)</w:t>
             </w:r>
           </w:p>
         </w:tc>
@@ -7477,7 +7477,7 @@
                 <w:i w:val="0"/>
                 <w:sz w:val="26"/>
               </w:rPr>
-              <w:t>Website downtime hoặc lỗi kết nối CSDL sau deploy</w:t>
+              <w:t>Website gián đoạn hoặc lỗi kết nối cơ sở dữ liệu sau khi triển khai</w:t>
             </w:r>
           </w:p>
         </w:tc>
@@ -7548,7 +7548,7 @@
                 <w:i w:val="0"/>
                 <w:sz w:val="26"/>
               </w:rPr>
-              <w:t>Theo dõi PageSpeed/LCP (mục tiêu duy trì LCP trong ngưỡng an toàn đã đạt 2.3s ở môi trường phát triển); tối ưu truy vấn danh sách sản phẩm; kiểm thử tương thích đa trình duyệt trước bàn giao</w:t>
+              <w:t>Theo dõi PageSpeed/LCP (duy trì LCP trong ngưỡng an toàn; kết quả đo ở môi trường phát triển đã đạt 2.3 giây); tối ưu truy vấn danh sách sản phẩm; kiểm thử tương thích đa trình duyệt trước bàn giao</w:t>
             </w:r>
           </w:p>
         </w:tc>
@@ -7594,7 +7594,7 @@
                 <w:i w:val="0"/>
                 <w:sz w:val="26"/>
               </w:rPr>
-              <w:t>Performance giảm hoặc lỗi responsive trên mobile trong regression test</w:t>
+              <w:t>Hiệu năng giảm hoặc lỗi giao diện responsive trên mobile trong kiểm thử hồi quy</w:t>
             </w:r>
           </w:p>
         </w:tc>
@@ -7642,7 +7642,7 @@
           <w:i w:val="0"/>
           <w:sz w:val="26"/>
         </w:rPr>
-        <w:t>Các hành động trên tận dụng sẵn cơ chế đã có của dự án: mô hình Agile nhận thay đổi có kiểm soát, quỹ dự phòng 10%, giám sát đường găng, quy trình code review, kế hoạch kiểm thử (unit, tích hợp, hệ thống, UAT) và tiêu chuẩn chất lượng về bảo mật, tốc độ tải, UX.</w:t>
+        <w:t>Các hành động trên tận dụng sẵn cơ chế đã có của dự án: mô hình Agile nhận thay đổi có kiểm soát, quỹ dự phòng 10%, giám sát đường găng, quy trình code review, kế hoạch kiểm thử (đơn vị, tích hợp, hệ thống, UAT) và tiêu chuẩn chất lượng về bảo mật, tốc độ tải, UX/UI.</w:t>
       </w:r>
     </w:p>
     <w:p>
@@ -7734,7 +7734,7 @@
           <w:i w:val="0"/>
           <w:sz w:val="26"/>
         </w:rPr>
-        <w:t>3. Khi có sự kiện kích hoạt (trigger) như chậm đường găng, lỗi tích hợp thanh toán, hoặc đề xuất thay đổi phạm vi lớn, PM triệu tập họp ngắn, ghi biên bản và cập nhật Trello/GitHub tương ứng.</w:t>
+        <w:t>3. Khi có sự kiện kích hoạt như chậm đường găng, lỗi tích hợp thanh toán, hoặc đề xuất thay đổi phạm vi lớn, PM triệu tập họp ngắn, ghi biên bản và cập nhật Trello/GitHub tương ứng.</w:t>
       </w:r>
     </w:p>
     <w:p>
@@ -7764,7 +7764,7 @@
           <w:i w:val="0"/>
           <w:sz w:val="26"/>
         </w:rPr>
-        <w:t>5. Mọi rủi ro đóng vẫn được lưu trong sổ đăng ký rủi ro để phục vụ bàn giao và các giai đoạn mở rộng sau này (không đưa ngay vào phạm vi hiện tại những hạng mục đã loại trừ như app mobile hay thanh toán thẻ quốc tế).</w:t>
+        <w:t>5. Mọi rủi ro đã đóng vẫn được lưu trong sổ đăng ký rủi ro để phục vụ bàn giao; các hướng mở rộng sau này (ứng dụng di động, thanh toán thẻ quốc tế) không đưa vào phạm vi hiện tại vì đã được loại trừ khi xác định phạm vi.</w:t>
       </w:r>
     </w:p>
     <w:p>
@@ -7998,7 +7998,7 @@
                 <w:i w:val="0"/>
                 <w:sz w:val="26"/>
               </w:rPr>
-              <w:t>Cao / TB / Thấp</w:t>
+              <w:t>Cao</w:t>
             </w:r>
           </w:p>
         </w:tc>
@@ -8021,7 +8021,7 @@
                 <w:i w:val="0"/>
                 <w:sz w:val="26"/>
               </w:rPr>
-              <w:t>Mở hoặc Đóng</w:t>
+              <w:t>Đang xử lý</w:t>
             </w:r>
           </w:p>
         </w:tc>
@@ -8044,7 +8044,7 @@
                 <w:i w:val="0"/>
                 <w:sz w:val="26"/>
               </w:rPr>
-              <w:t>...</w:t>
+              <w:t>Ưu tiên các gói Backend trên đường găng; họp standup hàng ngày</w:t>
             </w:r>
           </w:p>
         </w:tc>
@@ -8067,7 +8067,7 @@
                 <w:i w:val="0"/>
                 <w:sz w:val="26"/>
               </w:rPr>
-              <w:t>...</w:t>
+              <w:t>Cuối tuần báo cáo</w:t>
             </w:r>
           </w:p>
         </w:tc>
@@ -8090,7 +8090,287 @@
                 <w:i w:val="0"/>
                 <w:sz w:val="26"/>
               </w:rPr>
-              <w:t>...</w:t>
+              <w:t>Theo dõi sát trước mốc M3</w:t>
+            </w:r>
+          </w:p>
+        </w:tc>
+      </w:tr>
+      <w:tr>
+        <w:tc>
+          <w:tcPr>
+            <w:tcW w:type="dxa" w:w="1567"/>
+            <w:tcBorders>
+              <w:top w:val="single" w:sz="4" w:space="0" w:color="000000"/>
+              <w:left w:val="single" w:sz="4" w:space="0" w:color="000000"/>
+              <w:bottom w:val="single" w:sz="4" w:space="0" w:color="000000"/>
+              <w:right w:val="single" w:sz="4" w:space="0" w:color="000000"/>
+            </w:tcBorders>
+          </w:tcPr>
+          <w:p>
+            <w:r/>
+            <w:r>
+              <w:rPr>
+                <w:rFonts w:ascii="Times New Roman" w:hAnsi="Times New Roman" w:eastAsia="Times New Roman" w:cs="Times New Roman"/>
+                <w:b w:val="0"/>
+                <w:i w:val="0"/>
+                <w:sz w:val="26"/>
+              </w:rPr>
+              <w:t>R03</w:t>
+            </w:r>
+          </w:p>
+        </w:tc>
+        <w:tc>
+          <w:tcPr>
+            <w:tcW w:type="dxa" w:w="1567"/>
+            <w:tcBorders>
+              <w:top w:val="single" w:sz="4" w:space="0" w:color="000000"/>
+              <w:left w:val="single" w:sz="4" w:space="0" w:color="000000"/>
+              <w:bottom w:val="single" w:sz="4" w:space="0" w:color="000000"/>
+              <w:right w:val="single" w:sz="4" w:space="0" w:color="000000"/>
+            </w:tcBorders>
+          </w:tcPr>
+          <w:p>
+            <w:r/>
+            <w:r>
+              <w:rPr>
+                <w:rFonts w:ascii="Times New Roman" w:hAnsi="Times New Roman" w:eastAsia="Times New Roman" w:cs="Times New Roman"/>
+                <w:b w:val="0"/>
+                <w:i w:val="0"/>
+                <w:sz w:val="26"/>
+              </w:rPr>
+              <w:t>Cao</w:t>
+            </w:r>
+          </w:p>
+        </w:tc>
+        <w:tc>
+          <w:tcPr>
+            <w:tcW w:type="dxa" w:w="1567"/>
+            <w:tcBorders>
+              <w:top w:val="single" w:sz="4" w:space="0" w:color="000000"/>
+              <w:left w:val="single" w:sz="4" w:space="0" w:color="000000"/>
+              <w:bottom w:val="single" w:sz="4" w:space="0" w:color="000000"/>
+              <w:right w:val="single" w:sz="4" w:space="0" w:color="000000"/>
+            </w:tcBorders>
+          </w:tcPr>
+          <w:p>
+            <w:r/>
+            <w:r>
+              <w:rPr>
+                <w:rFonts w:ascii="Times New Roman" w:hAnsi="Times New Roman" w:eastAsia="Times New Roman" w:cs="Times New Roman"/>
+                <w:b w:val="0"/>
+                <w:i w:val="0"/>
+                <w:sz w:val="26"/>
+              </w:rPr>
+              <w:t>Đang xử lý</w:t>
+            </w:r>
+          </w:p>
+        </w:tc>
+        <w:tc>
+          <w:tcPr>
+            <w:tcW w:type="dxa" w:w="1567"/>
+            <w:tcBorders>
+              <w:top w:val="single" w:sz="4" w:space="0" w:color="000000"/>
+              <w:left w:val="single" w:sz="4" w:space="0" w:color="000000"/>
+              <w:bottom w:val="single" w:sz="4" w:space="0" w:color="000000"/>
+              <w:right w:val="single" w:sz="4" w:space="0" w:color="000000"/>
+            </w:tcBorders>
+          </w:tcPr>
+          <w:p>
+            <w:r/>
+            <w:r>
+              <w:rPr>
+                <w:rFonts w:ascii="Times New Roman" w:hAnsi="Times New Roman" w:eastAsia="Times New Roman" w:cs="Times New Roman"/>
+                <w:b w:val="0"/>
+                <w:i w:val="0"/>
+                <w:sz w:val="26"/>
+              </w:rPr>
+              <w:t>Bổ sung test tích hợp thanh toán VNPAY/QR trong Sprint 3</w:t>
+            </w:r>
+          </w:p>
+        </w:tc>
+        <w:tc>
+          <w:tcPr>
+            <w:tcW w:type="dxa" w:w="1567"/>
+            <w:tcBorders>
+              <w:top w:val="single" w:sz="4" w:space="0" w:color="000000"/>
+              <w:left w:val="single" w:sz="4" w:space="0" w:color="000000"/>
+              <w:bottom w:val="single" w:sz="4" w:space="0" w:color="000000"/>
+              <w:right w:val="single" w:sz="4" w:space="0" w:color="000000"/>
+            </w:tcBorders>
+          </w:tcPr>
+          <w:p>
+            <w:r/>
+            <w:r>
+              <w:rPr>
+                <w:rFonts w:ascii="Times New Roman" w:hAnsi="Times New Roman" w:eastAsia="Times New Roman" w:cs="Times New Roman"/>
+                <w:b w:val="0"/>
+                <w:i w:val="0"/>
+                <w:sz w:val="26"/>
+              </w:rPr>
+              <w:t>Cuối Sprint Review</w:t>
+            </w:r>
+          </w:p>
+        </w:tc>
+        <w:tc>
+          <w:tcPr>
+            <w:tcW w:type="dxa" w:w="1567"/>
+            <w:tcBorders>
+              <w:top w:val="single" w:sz="4" w:space="0" w:color="000000"/>
+              <w:left w:val="single" w:sz="4" w:space="0" w:color="000000"/>
+              <w:bottom w:val="single" w:sz="4" w:space="0" w:color="000000"/>
+              <w:right w:val="single" w:sz="4" w:space="0" w:color="000000"/>
+            </w:tcBorders>
+          </w:tcPr>
+          <w:p>
+            <w:r/>
+            <w:r>
+              <w:rPr>
+                <w:rFonts w:ascii="Times New Roman" w:hAnsi="Times New Roman" w:eastAsia="Times New Roman" w:cs="Times New Roman"/>
+                <w:b w:val="0"/>
+                <w:i w:val="0"/>
+                <w:sz w:val="26"/>
+              </w:rPr>
+              <w:t>Chỉ đóng khi hết lỗi mức Cao</w:t>
+            </w:r>
+          </w:p>
+        </w:tc>
+      </w:tr>
+      <w:tr>
+        <w:tc>
+          <w:tcPr>
+            <w:tcW w:type="dxa" w:w="1567"/>
+            <w:tcBorders>
+              <w:top w:val="single" w:sz="4" w:space="0" w:color="000000"/>
+              <w:left w:val="single" w:sz="4" w:space="0" w:color="000000"/>
+              <w:bottom w:val="single" w:sz="4" w:space="0" w:color="000000"/>
+              <w:right w:val="single" w:sz="4" w:space="0" w:color="000000"/>
+            </w:tcBorders>
+          </w:tcPr>
+          <w:p>
+            <w:r/>
+            <w:r>
+              <w:rPr>
+                <w:rFonts w:ascii="Times New Roman" w:hAnsi="Times New Roman" w:eastAsia="Times New Roman" w:cs="Times New Roman"/>
+                <w:b w:val="0"/>
+                <w:i w:val="0"/>
+                <w:sz w:val="26"/>
+              </w:rPr>
+              <w:t>R07</w:t>
+            </w:r>
+          </w:p>
+        </w:tc>
+        <w:tc>
+          <w:tcPr>
+            <w:tcW w:type="dxa" w:w="1567"/>
+            <w:tcBorders>
+              <w:top w:val="single" w:sz="4" w:space="0" w:color="000000"/>
+              <w:left w:val="single" w:sz="4" w:space="0" w:color="000000"/>
+              <w:bottom w:val="single" w:sz="4" w:space="0" w:color="000000"/>
+              <w:right w:val="single" w:sz="4" w:space="0" w:color="000000"/>
+            </w:tcBorders>
+          </w:tcPr>
+          <w:p>
+            <w:r/>
+            <w:r>
+              <w:rPr>
+                <w:rFonts w:ascii="Times New Roman" w:hAnsi="Times New Roman" w:eastAsia="Times New Roman" w:cs="Times New Roman"/>
+                <w:b w:val="0"/>
+                <w:i w:val="0"/>
+                <w:sz w:val="26"/>
+              </w:rPr>
+              <w:t>Cao</w:t>
+            </w:r>
+          </w:p>
+        </w:tc>
+        <w:tc>
+          <w:tcPr>
+            <w:tcW w:type="dxa" w:w="1567"/>
+            <w:tcBorders>
+              <w:top w:val="single" w:sz="4" w:space="0" w:color="000000"/>
+              <w:left w:val="single" w:sz="4" w:space="0" w:color="000000"/>
+              <w:bottom w:val="single" w:sz="4" w:space="0" w:color="000000"/>
+              <w:right w:val="single" w:sz="4" w:space="0" w:color="000000"/>
+            </w:tcBorders>
+          </w:tcPr>
+          <w:p>
+            <w:r/>
+            <w:r>
+              <w:rPr>
+                <w:rFonts w:ascii="Times New Roman" w:hAnsi="Times New Roman" w:eastAsia="Times New Roman" w:cs="Times New Roman"/>
+                <w:b w:val="0"/>
+                <w:i w:val="0"/>
+                <w:sz w:val="26"/>
+              </w:rPr>
+              <w:t>Mở</w:t>
+            </w:r>
+          </w:p>
+        </w:tc>
+        <w:tc>
+          <w:tcPr>
+            <w:tcW w:type="dxa" w:w="1567"/>
+            <w:tcBorders>
+              <w:top w:val="single" w:sz="4" w:space="0" w:color="000000"/>
+              <w:left w:val="single" w:sz="4" w:space="0" w:color="000000"/>
+              <w:bottom w:val="single" w:sz="4" w:space="0" w:color="000000"/>
+              <w:right w:val="single" w:sz="4" w:space="0" w:color="000000"/>
+            </w:tcBorders>
+          </w:tcPr>
+          <w:p>
+            <w:r/>
+            <w:r>
+              <w:rPr>
+                <w:rFonts w:ascii="Times New Roman" w:hAnsi="Times New Roman" w:eastAsia="Times New Roman" w:cs="Times New Roman"/>
+                <w:b w:val="0"/>
+                <w:i w:val="0"/>
+                <w:sz w:val="26"/>
+              </w:rPr>
+              <w:t>Review bảo mật và hoàn tất SSL trước triển khai</w:t>
+            </w:r>
+          </w:p>
+        </w:tc>
+        <w:tc>
+          <w:tcPr>
+            <w:tcW w:type="dxa" w:w="1567"/>
+            <w:tcBorders>
+              <w:top w:val="single" w:sz="4" w:space="0" w:color="000000"/>
+              <w:left w:val="single" w:sz="4" w:space="0" w:color="000000"/>
+              <w:bottom w:val="single" w:sz="4" w:space="0" w:color="000000"/>
+              <w:right w:val="single" w:sz="4" w:space="0" w:color="000000"/>
+            </w:tcBorders>
+          </w:tcPr>
+          <w:p>
+            <w:r/>
+            <w:r>
+              <w:rPr>
+                <w:rFonts w:ascii="Times New Roman" w:hAnsi="Times New Roman" w:eastAsia="Times New Roman" w:cs="Times New Roman"/>
+                <w:b w:val="0"/>
+                <w:i w:val="0"/>
+                <w:sz w:val="26"/>
+              </w:rPr>
+              <w:t>Họp tuần</w:t>
+            </w:r>
+          </w:p>
+        </w:tc>
+        <w:tc>
+          <w:tcPr>
+            <w:tcW w:type="dxa" w:w="1567"/>
+            <w:tcBorders>
+              <w:top w:val="single" w:sz="4" w:space="0" w:color="000000"/>
+              <w:left w:val="single" w:sz="4" w:space="0" w:color="000000"/>
+              <w:bottom w:val="single" w:sz="4" w:space="0" w:color="000000"/>
+              <w:right w:val="single" w:sz="4" w:space="0" w:color="000000"/>
+            </w:tcBorders>
+          </w:tcPr>
+          <w:p>
+            <w:r/>
+            <w:r>
+              <w:rPr>
+                <w:rFonts w:ascii="Times New Roman" w:hAnsi="Times New Roman" w:eastAsia="Times New Roman" w:cs="Times New Roman"/>
+                <w:b w:val="0"/>
+                <w:i w:val="0"/>
+                <w:sz w:val="26"/>
+              </w:rPr>
+              <w:t>Gắn với checklist WBS 7.1</w:t>
             </w:r>
           </w:p>
         </w:tc>
@@ -8153,7 +8433,7 @@
           <w:i w:val="0"/>
           <w:sz w:val="26"/>
         </w:rPr>
-        <w:t>Chương 5 đã thiết lập kế hoạch truyền thông gắn với các bên liên quan và ma trận RACI, xác định bộ công cụ Email, Zalo, Google Meet, Trello, GitHub cùng chế độ báo cáo tuần và biên bản họp. Đồng thời, chương đã xây dựng danh mục rủi ro phù hợp thực tiễn dự án HOALYLY.vn, đánh giá định tính bằng ma trận xác suất - tác động, đề xuất chiến lược ứng phó và cơ chế giám sát định kỳ. Các nội dung này bổ sung lớp kiểm soát mềm cho các yếu tố phạm vi, tiến độ, chi phí và chất lượng đã trình bày ở các chương trước, giúp dự án duy trì sự thống nhất thông tin và chủ động trước biến động trong quá trình triển khai website trên nền tảng .NET.</w:t>
+        <w:t>Chương 5 đã thiết lập kế hoạch truyền thông gắn với các bên liên quan và ma trận RACI, xác định bộ công cụ Email, Zalo, Google Meet, Trello, GitHub cùng chế độ báo cáo tuần và biên bản họp. Đồng thời, chương đã xây dựng danh mục rủi ro phù hợp thực tiễn dự án HOALYLY.vn, đánh giá định tính bằng ma trận xác suất - tác động, đề xuất chiến lược ứng phó và cơ chế giám sát định kỳ. Các nội dung này bổ sung lớp kiểm soát cho phạm vi, tiến độ, chi phí và chất lượng đã trình bày ở các chương trước, giúp dự án duy trì sự thống nhất thông tin và chủ động trước biến động trong quá trình triển khai website trên nền tảng .NET.</w:t>
       </w:r>
     </w:p>
     <w:sectPr>

</xml_diff>